<commit_message>
Replace FAQ widget with LIHANA chatbot
</commit_message>
<xml_diff>
--- a/others/Project stracture.docx
+++ b/others/Project stracture.docx
@@ -1,6 +1,6 @@
 
 <file path=word/document.xml><?xml version="1.0" encoding="utf-8"?>
-<w:document xmlns:wpc="http://schemas.microsoft.com/office/word/2010/wordprocessingCanvas" xmlns:cx="http://schemas.microsoft.com/office/drawing/2014/chartex" xmlns:cx1="http://schemas.microsoft.com/office/drawing/2015/9/8/chartex" xmlns:cx2="http://schemas.microsoft.com/office/drawing/2015/10/21/chartex" xmlns:cx3="http://schemas.microsoft.com/office/drawing/2016/5/9/chartex" xmlns:cx4="http://schemas.microsoft.com/office/drawing/2016/5/10/chartex" xmlns:cx5="http://schemas.microsoft.com/office/drawing/2016/5/11/chartex" xmlns:cx6="http://schemas.microsoft.com/office/drawing/2016/5/12/chartex" xmlns:cx7="http://schemas.microsoft.com/office/drawing/2016/5/13/chartex" xmlns:cx8="http://schemas.microsoft.com/office/drawing/2016/5/14/chartex" xmlns:mc="http://schemas.openxmlformats.org/markup-compatibility/2006" xmlns:aink="http://schemas.microsoft.com/office/drawing/2016/ink" xmlns:am3d="http://schemas.microsoft.com/office/drawing/2017/model3d" xmlns:o="urn:schemas-microsoft-com:office:office" xmlns:r="http://schemas.openxmlformats.org/officeDocument/2006/relationships" xmlns:m="http://schemas.openxmlformats.org/officeDocument/2006/math" xmlns:v="urn:schemas-microsoft-com:vml" xmlns:wp14="http://schemas.microsoft.com/office/word/2010/wordprocessingDrawing" xmlns:wp="http://schemas.openxmlformats.org/drawingml/2006/wordprocessingDrawing" xmlns:w10="urn:schemas-microsoft-com:office:word" xmlns:w="http://schemas.openxmlformats.org/wordprocessingml/2006/main" xmlns:w14="http://schemas.microsoft.com/office/word/2010/wordml" xmlns:w15="http://schemas.microsoft.com/office/word/2012/wordml" xmlns:w16cex="http://schemas.microsoft.com/office/word/2018/wordml/cex" xmlns:w16cid="http://schemas.microsoft.com/office/word/2016/wordml/cid" xmlns:w16="http://schemas.microsoft.com/office/word/2018/wordml" xmlns:w16sdtdh="http://schemas.microsoft.com/office/word/2020/wordml/sdtdatahash" xmlns:w16se="http://schemas.microsoft.com/office/word/2015/wordml/symex" xmlns:wpg="http://schemas.microsoft.com/office/word/2010/wordprocessingGroup" xmlns:wpi="http://schemas.microsoft.com/office/word/2010/wordprocessingInk" xmlns:wne="http://schemas.microsoft.com/office/word/2006/wordml" xmlns:wps="http://schemas.microsoft.com/office/word/2010/wordprocessingShape" mc:Ignorable="w14 w15 w16se w16cid w16 w16cex w16sdtdh wp14">
+<w:document xmlns:wpc="http://schemas.microsoft.com/office/word/2010/wordprocessingCanvas" xmlns:cx="http://schemas.microsoft.com/office/drawing/2014/chartex" xmlns:cx1="http://schemas.microsoft.com/office/drawing/2015/9/8/chartex" xmlns:cx2="http://schemas.microsoft.com/office/drawing/2015/10/21/chartex" xmlns:cx3="http://schemas.microsoft.com/office/drawing/2016/5/9/chartex" xmlns:cx4="http://schemas.microsoft.com/office/drawing/2016/5/10/chartex" xmlns:cx5="http://schemas.microsoft.com/office/drawing/2016/5/11/chartex" xmlns:cx6="http://schemas.microsoft.com/office/drawing/2016/5/12/chartex" xmlns:cx7="http://schemas.microsoft.com/office/drawing/2016/5/13/chartex" xmlns:cx8="http://schemas.microsoft.com/office/drawing/2016/5/14/chartex" xmlns:mc="http://schemas.openxmlformats.org/markup-compatibility/2006" xmlns:aink="http://schemas.microsoft.com/office/drawing/2016/ink" xmlns:am3d="http://schemas.microsoft.com/office/drawing/2017/model3d" xmlns:o="urn:schemas-microsoft-com:office:office" xmlns:oel="http://schemas.microsoft.com/office/2019/extlst" xmlns:r="http://schemas.openxmlformats.org/officeDocument/2006/relationships" xmlns:m="http://schemas.openxmlformats.org/officeDocument/2006/math" xmlns:v="urn:schemas-microsoft-com:vml" xmlns:wp14="http://schemas.microsoft.com/office/word/2010/wordprocessingDrawing" xmlns:wp="http://schemas.openxmlformats.org/drawingml/2006/wordprocessingDrawing" xmlns:w10="urn:schemas-microsoft-com:office:word" xmlns:w="http://schemas.openxmlformats.org/wordprocessingml/2006/main" xmlns:w14="http://schemas.microsoft.com/office/word/2010/wordml" xmlns:w15="http://schemas.microsoft.com/office/word/2012/wordml" xmlns:w16cex="http://schemas.microsoft.com/office/word/2018/wordml/cex" xmlns:w16cid="http://schemas.microsoft.com/office/word/2016/wordml/cid" xmlns:w16="http://schemas.microsoft.com/office/word/2018/wordml" xmlns:w16du="http://schemas.microsoft.com/office/word/2023/wordml/word16du" xmlns:w16sdtdh="http://schemas.microsoft.com/office/word/2020/wordml/sdtdatahash" xmlns:w16sdtfl="http://schemas.microsoft.com/office/word/2024/wordml/sdtformatlock" xmlns:w16se="http://schemas.microsoft.com/office/word/2015/wordml/symex" xmlns:wpg="http://schemas.microsoft.com/office/word/2010/wordprocessingGroup" xmlns:wpi="http://schemas.microsoft.com/office/word/2010/wordprocessingInk" xmlns:wne="http://schemas.microsoft.com/office/word/2006/wordml" xmlns:wps="http://schemas.microsoft.com/office/word/2010/wordprocessingShape" mc:Ignorable="w14 w15 w16se w16cid w16 w16cex w16sdtdh w16sdtfl w16du wp14">
   <w:body>
     <w:p>
       <w:r>
@@ -374,6 +374,852 @@
         <w:t xml:space="preserve"> next.config.js</w:t>
       </w:r>
     </w:p>
+    <w:p/>
+    <w:p/>
+    <w:p/>
+    <w:p>
+      <w:pPr>
+        <w:pStyle w:val="NormalWeb"/>
+      </w:pPr>
+      <w:r>
+        <w:rPr>
+          <w:rStyle w:val="Strong"/>
+        </w:rPr>
+        <w:t>my-website/</w:t>
+      </w:r>
+    </w:p>
+    <w:p>
+      <w:pPr>
+        <w:pStyle w:val="NormalWeb"/>
+        <w:numPr>
+          <w:ilvl w:val="0"/>
+          <w:numId w:val="1"/>
+        </w:numPr>
+        <w:rPr>
+          <w:rFonts w:asciiTheme="minorBidi" w:hAnsiTheme="minorBidi" w:cstheme="minorBidi"/>
+        </w:rPr>
+      </w:pPr>
+      <w:r>
+        <w:rPr>
+          <w:rStyle w:val="Strong"/>
+          <w:rFonts w:asciiTheme="minorBidi" w:hAnsiTheme="minorBidi" w:cstheme="minorBidi"/>
+        </w:rPr>
+        <w:t>app/</w:t>
+      </w:r>
+    </w:p>
+    <w:p>
+      <w:pPr>
+        <w:pStyle w:val="NormalWeb"/>
+        <w:numPr>
+          <w:ilvl w:val="1"/>
+          <w:numId w:val="1"/>
+        </w:numPr>
+        <w:rPr>
+          <w:rFonts w:asciiTheme="minorBidi" w:hAnsiTheme="minorBidi" w:cstheme="minorBidi"/>
+        </w:rPr>
+      </w:pPr>
+      <w:proofErr w:type="spellStart"/>
+      <w:r>
+        <w:rPr>
+          <w:rStyle w:val="HTMLCode"/>
+          <w:rFonts w:asciiTheme="minorBidi" w:hAnsiTheme="minorBidi" w:cstheme="minorBidi"/>
+        </w:rPr>
+        <w:t>layout.tsx</w:t>
+      </w:r>
+      <w:proofErr w:type="spellEnd"/>
+    </w:p>
+    <w:p>
+      <w:pPr>
+        <w:pStyle w:val="NormalWeb"/>
+        <w:numPr>
+          <w:ilvl w:val="1"/>
+          <w:numId w:val="1"/>
+        </w:numPr>
+        <w:rPr>
+          <w:rFonts w:asciiTheme="minorBidi" w:hAnsiTheme="minorBidi" w:cstheme="minorBidi"/>
+        </w:rPr>
+      </w:pPr>
+      <w:proofErr w:type="spellStart"/>
+      <w:r>
+        <w:rPr>
+          <w:rStyle w:val="HTMLCode"/>
+          <w:rFonts w:asciiTheme="minorBidi" w:hAnsiTheme="minorBidi" w:cstheme="minorBidi"/>
+        </w:rPr>
+        <w:t>page.tsx</w:t>
+      </w:r>
+      <w:proofErr w:type="spellEnd"/>
+    </w:p>
+    <w:p>
+      <w:pPr>
+        <w:pStyle w:val="NormalWeb"/>
+        <w:numPr>
+          <w:ilvl w:val="0"/>
+          <w:numId w:val="1"/>
+        </w:numPr>
+        <w:rPr>
+          <w:rStyle w:val="Strong"/>
+          <w:rFonts w:asciiTheme="minorBidi" w:hAnsiTheme="minorBidi" w:cstheme="minorBidi"/>
+          <w:b w:val="0"/>
+          <w:bCs w:val="0"/>
+        </w:rPr>
+      </w:pPr>
+      <w:r>
+        <w:rPr>
+          <w:rStyle w:val="Strong"/>
+          <w:rFonts w:asciiTheme="minorBidi" w:hAnsiTheme="minorBidi" w:cstheme="minorBidi"/>
+        </w:rPr>
+        <w:t>components/</w:t>
+      </w:r>
+    </w:p>
+    <w:p>
+      <w:pPr>
+        <w:pStyle w:val="NormalWeb"/>
+        <w:numPr>
+          <w:ilvl w:val="1"/>
+          <w:numId w:val="1"/>
+        </w:numPr>
+        <w:rPr>
+          <w:rStyle w:val="HTMLCode"/>
+          <w:rFonts w:asciiTheme="minorBidi" w:hAnsiTheme="minorBidi" w:cstheme="minorBidi"/>
+        </w:rPr>
+      </w:pPr>
+      <w:proofErr w:type="spellStart"/>
+      <w:r>
+        <w:rPr>
+          <w:rStyle w:val="HTMLCode"/>
+          <w:rFonts w:asciiTheme="minorBidi" w:hAnsiTheme="minorBidi" w:cstheme="minorBidi"/>
+        </w:rPr>
+        <w:t>AboutSection</w:t>
+      </w:r>
+      <w:r>
+        <w:rPr>
+          <w:rStyle w:val="HTMLCode"/>
+          <w:rFonts w:asciiTheme="minorBidi" w:hAnsiTheme="minorBidi" w:cstheme="minorBidi"/>
+        </w:rPr>
+        <w:t>.tsx</w:t>
+      </w:r>
+      <w:proofErr w:type="spellEnd"/>
+    </w:p>
+    <w:p>
+      <w:pPr>
+        <w:pStyle w:val="NormalWeb"/>
+        <w:numPr>
+          <w:ilvl w:val="1"/>
+          <w:numId w:val="1"/>
+        </w:numPr>
+        <w:rPr>
+          <w:rStyle w:val="HTMLCode"/>
+          <w:rFonts w:asciiTheme="minorBidi" w:hAnsiTheme="minorBidi" w:cstheme="minorBidi"/>
+        </w:rPr>
+      </w:pPr>
+      <w:proofErr w:type="spellStart"/>
+      <w:r>
+        <w:rPr>
+          <w:rStyle w:val="HTMLCode"/>
+          <w:rFonts w:asciiTheme="minorBidi" w:hAnsiTheme="minorBidi" w:cstheme="minorBidi"/>
+        </w:rPr>
+        <w:t>Breadcrumb</w:t>
+      </w:r>
+      <w:r>
+        <w:rPr>
+          <w:rStyle w:val="HTMLCode"/>
+          <w:rFonts w:asciiTheme="minorBidi" w:hAnsiTheme="minorBidi" w:cstheme="minorBidi"/>
+        </w:rPr>
+        <w:t>.tsx</w:t>
+      </w:r>
+      <w:proofErr w:type="spellEnd"/>
+    </w:p>
+    <w:p>
+      <w:pPr>
+        <w:pStyle w:val="NormalWeb"/>
+        <w:numPr>
+          <w:ilvl w:val="1"/>
+          <w:numId w:val="1"/>
+        </w:numPr>
+        <w:rPr>
+          <w:rStyle w:val="HTMLCode"/>
+          <w:rFonts w:asciiTheme="minorBidi" w:hAnsiTheme="minorBidi" w:cstheme="minorBidi"/>
+        </w:rPr>
+      </w:pPr>
+      <w:proofErr w:type="spellStart"/>
+      <w:r>
+        <w:rPr>
+          <w:rStyle w:val="HTMLCode"/>
+          <w:rFonts w:asciiTheme="minorBidi" w:hAnsiTheme="minorBidi" w:cstheme="minorBidi"/>
+        </w:rPr>
+        <w:t>Chatbot.tsx</w:t>
+      </w:r>
+      <w:proofErr w:type="spellEnd"/>
+    </w:p>
+    <w:p>
+      <w:pPr>
+        <w:pStyle w:val="NormalWeb"/>
+        <w:numPr>
+          <w:ilvl w:val="1"/>
+          <w:numId w:val="1"/>
+        </w:numPr>
+        <w:rPr>
+          <w:rStyle w:val="HTMLCode"/>
+          <w:rFonts w:asciiTheme="minorBidi" w:hAnsiTheme="minorBidi" w:cstheme="minorBidi"/>
+        </w:rPr>
+      </w:pPr>
+      <w:proofErr w:type="spellStart"/>
+      <w:r>
+        <w:rPr>
+          <w:rStyle w:val="HTMLCode"/>
+          <w:rFonts w:asciiTheme="minorBidi" w:hAnsiTheme="minorBidi" w:cstheme="minorBidi"/>
+        </w:rPr>
+        <w:t>ChatToggleButton</w:t>
+      </w:r>
+      <w:r>
+        <w:rPr>
+          <w:rStyle w:val="HTMLCode"/>
+          <w:rFonts w:asciiTheme="minorBidi" w:hAnsiTheme="minorBidi" w:cstheme="minorBidi"/>
+        </w:rPr>
+        <w:t>.tsx</w:t>
+      </w:r>
+      <w:proofErr w:type="spellEnd"/>
+    </w:p>
+    <w:p>
+      <w:pPr>
+        <w:pStyle w:val="NormalWeb"/>
+        <w:numPr>
+          <w:ilvl w:val="1"/>
+          <w:numId w:val="1"/>
+        </w:numPr>
+        <w:rPr>
+          <w:rStyle w:val="HTMLCode"/>
+          <w:rFonts w:asciiTheme="minorBidi" w:hAnsiTheme="minorBidi" w:cstheme="minorBidi"/>
+        </w:rPr>
+      </w:pPr>
+      <w:proofErr w:type="spellStart"/>
+      <w:r>
+        <w:rPr>
+          <w:rStyle w:val="HTMLCode"/>
+          <w:rFonts w:asciiTheme="minorBidi" w:hAnsiTheme="minorBidi" w:cstheme="minorBidi"/>
+        </w:rPr>
+        <w:t>ChatWrapper</w:t>
+      </w:r>
+      <w:r>
+        <w:rPr>
+          <w:rStyle w:val="HTMLCode"/>
+          <w:rFonts w:asciiTheme="minorBidi" w:hAnsiTheme="minorBidi" w:cstheme="minorBidi"/>
+        </w:rPr>
+        <w:t>.tsx</w:t>
+      </w:r>
+      <w:proofErr w:type="spellEnd"/>
+    </w:p>
+    <w:p>
+      <w:pPr>
+        <w:pStyle w:val="NormalWeb"/>
+        <w:numPr>
+          <w:ilvl w:val="1"/>
+          <w:numId w:val="1"/>
+        </w:numPr>
+        <w:rPr>
+          <w:rStyle w:val="HTMLCode"/>
+          <w:rFonts w:asciiTheme="minorBidi" w:hAnsiTheme="minorBidi" w:cstheme="minorBidi"/>
+        </w:rPr>
+      </w:pPr>
+      <w:proofErr w:type="spellStart"/>
+      <w:r>
+        <w:rPr>
+          <w:rStyle w:val="HTMLCode"/>
+          <w:rFonts w:asciiTheme="minorBidi" w:hAnsiTheme="minorBidi" w:cstheme="minorBidi"/>
+        </w:rPr>
+        <w:t>ContactForm</w:t>
+      </w:r>
+      <w:r>
+        <w:rPr>
+          <w:rStyle w:val="HTMLCode"/>
+          <w:rFonts w:asciiTheme="minorBidi" w:hAnsiTheme="minorBidi" w:cstheme="minorBidi"/>
+        </w:rPr>
+        <w:t>.tsx</w:t>
+      </w:r>
+      <w:proofErr w:type="spellEnd"/>
+    </w:p>
+    <w:p>
+      <w:pPr>
+        <w:pStyle w:val="NormalWeb"/>
+        <w:numPr>
+          <w:ilvl w:val="1"/>
+          <w:numId w:val="1"/>
+        </w:numPr>
+        <w:rPr>
+          <w:rStyle w:val="HTMLCode"/>
+          <w:rFonts w:asciiTheme="minorBidi" w:hAnsiTheme="minorBidi" w:cstheme="minorBidi"/>
+        </w:rPr>
+      </w:pPr>
+      <w:proofErr w:type="spellStart"/>
+      <w:r>
+        <w:rPr>
+          <w:rStyle w:val="HTMLCode"/>
+          <w:rFonts w:asciiTheme="minorBidi" w:hAnsiTheme="minorBidi" w:cstheme="minorBidi"/>
+        </w:rPr>
+        <w:t>ContactSection</w:t>
+      </w:r>
+      <w:r>
+        <w:rPr>
+          <w:rStyle w:val="HTMLCode"/>
+          <w:rFonts w:asciiTheme="minorBidi" w:hAnsiTheme="minorBidi" w:cstheme="minorBidi"/>
+        </w:rPr>
+        <w:t>.tsx</w:t>
+      </w:r>
+      <w:proofErr w:type="spellEnd"/>
+    </w:p>
+    <w:p>
+      <w:pPr>
+        <w:pStyle w:val="NormalWeb"/>
+        <w:numPr>
+          <w:ilvl w:val="1"/>
+          <w:numId w:val="1"/>
+        </w:numPr>
+        <w:rPr>
+          <w:rStyle w:val="HTMLCode"/>
+          <w:rFonts w:asciiTheme="minorBidi" w:hAnsiTheme="minorBidi" w:cstheme="minorBidi"/>
+        </w:rPr>
+      </w:pPr>
+      <w:proofErr w:type="spellStart"/>
+      <w:r>
+        <w:rPr>
+          <w:rStyle w:val="HTMLCode"/>
+          <w:rFonts w:asciiTheme="minorBidi" w:hAnsiTheme="minorBidi" w:cstheme="minorBidi"/>
+        </w:rPr>
+        <w:t>CTASection</w:t>
+      </w:r>
+      <w:r>
+        <w:rPr>
+          <w:rStyle w:val="HTMLCode"/>
+          <w:rFonts w:asciiTheme="minorBidi" w:hAnsiTheme="minorBidi" w:cstheme="minorBidi"/>
+        </w:rPr>
+        <w:t>.tsx</w:t>
+      </w:r>
+      <w:proofErr w:type="spellEnd"/>
+    </w:p>
+    <w:p>
+      <w:pPr>
+        <w:pStyle w:val="NormalWeb"/>
+        <w:numPr>
+          <w:ilvl w:val="1"/>
+          <w:numId w:val="1"/>
+        </w:numPr>
+        <w:rPr>
+          <w:rStyle w:val="HTMLCode"/>
+          <w:rFonts w:asciiTheme="minorBidi" w:hAnsiTheme="minorBidi" w:cstheme="minorBidi"/>
+        </w:rPr>
+      </w:pPr>
+      <w:proofErr w:type="spellStart"/>
+      <w:r>
+        <w:rPr>
+          <w:rStyle w:val="HTMLCode"/>
+          <w:rFonts w:asciiTheme="minorBidi" w:hAnsiTheme="minorBidi" w:cstheme="minorBidi"/>
+        </w:rPr>
+        <w:t>MobileNavbar</w:t>
+      </w:r>
+      <w:r>
+        <w:rPr>
+          <w:rStyle w:val="HTMLCode"/>
+          <w:rFonts w:asciiTheme="minorBidi" w:hAnsiTheme="minorBidi" w:cstheme="minorBidi"/>
+        </w:rPr>
+        <w:t>.tsx</w:t>
+      </w:r>
+      <w:proofErr w:type="spellEnd"/>
+    </w:p>
+    <w:p>
+      <w:pPr>
+        <w:pStyle w:val="NormalWeb"/>
+        <w:numPr>
+          <w:ilvl w:val="1"/>
+          <w:numId w:val="1"/>
+        </w:numPr>
+        <w:rPr>
+          <w:rFonts w:asciiTheme="minorBidi" w:hAnsiTheme="minorBidi" w:cstheme="minorBidi"/>
+        </w:rPr>
+      </w:pPr>
+      <w:proofErr w:type="spellStart"/>
+      <w:r>
+        <w:rPr>
+          <w:rStyle w:val="HTMLCode"/>
+          <w:rFonts w:asciiTheme="minorBidi" w:hAnsiTheme="minorBidi" w:cstheme="minorBidi"/>
+        </w:rPr>
+        <w:t>Navbar.tsx</w:t>
+      </w:r>
+      <w:proofErr w:type="spellEnd"/>
+    </w:p>
+    <w:p>
+      <w:pPr>
+        <w:pStyle w:val="NormalWeb"/>
+        <w:numPr>
+          <w:ilvl w:val="1"/>
+          <w:numId w:val="1"/>
+        </w:numPr>
+        <w:rPr>
+          <w:rFonts w:asciiTheme="minorBidi" w:hAnsiTheme="minorBidi" w:cstheme="minorBidi"/>
+        </w:rPr>
+      </w:pPr>
+      <w:proofErr w:type="spellStart"/>
+      <w:r>
+        <w:rPr>
+          <w:rStyle w:val="HTMLCode"/>
+          <w:rFonts w:asciiTheme="minorBidi" w:hAnsiTheme="minorBidi" w:cstheme="minorBidi"/>
+        </w:rPr>
+        <w:t>Hero.tsx</w:t>
+      </w:r>
+      <w:proofErr w:type="spellEnd"/>
+    </w:p>
+    <w:p>
+      <w:pPr>
+        <w:pStyle w:val="NormalWeb"/>
+        <w:numPr>
+          <w:ilvl w:val="1"/>
+          <w:numId w:val="1"/>
+        </w:numPr>
+        <w:rPr>
+          <w:rFonts w:asciiTheme="minorBidi" w:hAnsiTheme="minorBidi" w:cstheme="minorBidi"/>
+        </w:rPr>
+      </w:pPr>
+      <w:proofErr w:type="spellStart"/>
+      <w:r>
+        <w:rPr>
+          <w:rStyle w:val="HTMLCode"/>
+          <w:rFonts w:asciiTheme="minorBidi" w:hAnsiTheme="minorBidi" w:cstheme="minorBidi"/>
+        </w:rPr>
+        <w:t>Features.tsx</w:t>
+      </w:r>
+      <w:proofErr w:type="spellEnd"/>
+    </w:p>
+    <w:p>
+      <w:pPr>
+        <w:pStyle w:val="NormalWeb"/>
+        <w:numPr>
+          <w:ilvl w:val="1"/>
+          <w:numId w:val="1"/>
+        </w:numPr>
+        <w:rPr>
+          <w:rStyle w:val="HTMLCode"/>
+          <w:rFonts w:asciiTheme="minorBidi" w:hAnsiTheme="minorBidi" w:cstheme="minorBidi"/>
+          <w:sz w:val="24"/>
+          <w:szCs w:val="24"/>
+        </w:rPr>
+      </w:pPr>
+      <w:proofErr w:type="spellStart"/>
+      <w:r>
+        <w:rPr>
+          <w:rStyle w:val="HTMLCode"/>
+          <w:rFonts w:asciiTheme="minorBidi" w:hAnsiTheme="minorBidi" w:cstheme="minorBidi"/>
+        </w:rPr>
+        <w:t>Footer.tsx</w:t>
+      </w:r>
+      <w:proofErr w:type="spellEnd"/>
+    </w:p>
+    <w:p>
+      <w:pPr>
+        <w:pStyle w:val="NormalWeb"/>
+        <w:numPr>
+          <w:ilvl w:val="1"/>
+          <w:numId w:val="1"/>
+        </w:numPr>
+        <w:rPr>
+          <w:rStyle w:val="HTMLCode"/>
+          <w:rFonts w:asciiTheme="minorBidi" w:hAnsiTheme="minorBidi" w:cstheme="minorBidi"/>
+        </w:rPr>
+      </w:pPr>
+      <w:proofErr w:type="spellStart"/>
+      <w:r>
+        <w:rPr>
+          <w:rStyle w:val="HTMLCode"/>
+          <w:rFonts w:asciiTheme="minorBidi" w:hAnsiTheme="minorBidi" w:cstheme="minorBidi"/>
+        </w:rPr>
+        <w:t>NavbarWrapper</w:t>
+      </w:r>
+      <w:r>
+        <w:rPr>
+          <w:rStyle w:val="HTMLCode"/>
+          <w:rFonts w:asciiTheme="minorBidi" w:hAnsiTheme="minorBidi" w:cstheme="minorBidi"/>
+        </w:rPr>
+        <w:t>.tsx</w:t>
+      </w:r>
+      <w:proofErr w:type="spellEnd"/>
+    </w:p>
+    <w:p>
+      <w:pPr>
+        <w:pStyle w:val="NormalWeb"/>
+        <w:numPr>
+          <w:ilvl w:val="1"/>
+          <w:numId w:val="1"/>
+        </w:numPr>
+        <w:rPr>
+          <w:rStyle w:val="HTMLCode"/>
+          <w:rFonts w:asciiTheme="minorBidi" w:hAnsiTheme="minorBidi" w:cstheme="minorBidi"/>
+        </w:rPr>
+      </w:pPr>
+      <w:proofErr w:type="spellStart"/>
+      <w:r>
+        <w:rPr>
+          <w:rStyle w:val="HTMLCode"/>
+          <w:rFonts w:asciiTheme="minorBidi" w:hAnsiTheme="minorBidi" w:cstheme="minorBidi"/>
+        </w:rPr>
+        <w:t>NeuralNetworkBackground</w:t>
+      </w:r>
+      <w:r>
+        <w:rPr>
+          <w:rStyle w:val="HTMLCode"/>
+          <w:rFonts w:asciiTheme="minorBidi" w:hAnsiTheme="minorBidi" w:cstheme="minorBidi"/>
+        </w:rPr>
+        <w:t>.tsx</w:t>
+      </w:r>
+      <w:proofErr w:type="spellEnd"/>
+    </w:p>
+    <w:p>
+      <w:pPr>
+        <w:pStyle w:val="NormalWeb"/>
+        <w:numPr>
+          <w:ilvl w:val="1"/>
+          <w:numId w:val="1"/>
+        </w:numPr>
+        <w:rPr>
+          <w:rStyle w:val="HTMLCode"/>
+          <w:rFonts w:asciiTheme="minorBidi" w:hAnsiTheme="minorBidi" w:cstheme="minorBidi"/>
+        </w:rPr>
+      </w:pPr>
+      <w:proofErr w:type="spellStart"/>
+      <w:r>
+        <w:rPr>
+          <w:rStyle w:val="HTMLCode"/>
+          <w:rFonts w:asciiTheme="minorBidi" w:hAnsiTheme="minorBidi" w:cstheme="minorBidi"/>
+        </w:rPr>
+        <w:t>Preloader</w:t>
+      </w:r>
+      <w:r>
+        <w:rPr>
+          <w:rStyle w:val="HTMLCode"/>
+          <w:rFonts w:asciiTheme="minorBidi" w:hAnsiTheme="minorBidi" w:cstheme="minorBidi"/>
+        </w:rPr>
+        <w:t>.tsx</w:t>
+      </w:r>
+      <w:proofErr w:type="spellEnd"/>
+    </w:p>
+    <w:p>
+      <w:pPr>
+        <w:pStyle w:val="NormalWeb"/>
+        <w:numPr>
+          <w:ilvl w:val="1"/>
+          <w:numId w:val="1"/>
+        </w:numPr>
+        <w:rPr>
+          <w:rStyle w:val="HTMLCode"/>
+          <w:rFonts w:asciiTheme="minorBidi" w:hAnsiTheme="minorBidi" w:cstheme="minorBidi"/>
+        </w:rPr>
+      </w:pPr>
+      <w:proofErr w:type="spellStart"/>
+      <w:r>
+        <w:rPr>
+          <w:rStyle w:val="HTMLCode"/>
+          <w:rFonts w:asciiTheme="minorBidi" w:hAnsiTheme="minorBidi" w:cstheme="minorBidi"/>
+        </w:rPr>
+        <w:t>RequestQuoteForm</w:t>
+      </w:r>
+      <w:r>
+        <w:rPr>
+          <w:rStyle w:val="HTMLCode"/>
+          <w:rFonts w:asciiTheme="minorBidi" w:hAnsiTheme="minorBidi" w:cstheme="minorBidi"/>
+        </w:rPr>
+        <w:t>.tsx</w:t>
+      </w:r>
+      <w:proofErr w:type="spellEnd"/>
+    </w:p>
+    <w:p>
+      <w:pPr>
+        <w:pStyle w:val="NormalWeb"/>
+        <w:numPr>
+          <w:ilvl w:val="1"/>
+          <w:numId w:val="1"/>
+        </w:numPr>
+        <w:rPr>
+          <w:rStyle w:val="HTMLCode"/>
+          <w:rFonts w:asciiTheme="minorBidi" w:hAnsiTheme="minorBidi" w:cstheme="minorBidi"/>
+        </w:rPr>
+      </w:pPr>
+      <w:proofErr w:type="spellStart"/>
+      <w:r>
+        <w:rPr>
+          <w:rStyle w:val="HTMLCode"/>
+          <w:rFonts w:asciiTheme="minorBidi" w:hAnsiTheme="minorBidi" w:cstheme="minorBidi"/>
+        </w:rPr>
+        <w:t>SectionDivider</w:t>
+      </w:r>
+      <w:r>
+        <w:rPr>
+          <w:rStyle w:val="HTMLCode"/>
+          <w:rFonts w:asciiTheme="minorBidi" w:hAnsiTheme="minorBidi" w:cstheme="minorBidi"/>
+        </w:rPr>
+        <w:t>.tsx</w:t>
+      </w:r>
+      <w:proofErr w:type="spellEnd"/>
+    </w:p>
+    <w:p>
+      <w:pPr>
+        <w:pStyle w:val="NormalWeb"/>
+        <w:numPr>
+          <w:ilvl w:val="1"/>
+          <w:numId w:val="1"/>
+        </w:numPr>
+        <w:rPr>
+          <w:rStyle w:val="HTMLCode"/>
+          <w:rFonts w:asciiTheme="minorBidi" w:hAnsiTheme="minorBidi" w:cstheme="minorBidi"/>
+        </w:rPr>
+      </w:pPr>
+      <w:proofErr w:type="spellStart"/>
+      <w:r>
+        <w:rPr>
+          <w:rStyle w:val="HTMLCode"/>
+          <w:rFonts w:asciiTheme="minorBidi" w:hAnsiTheme="minorBidi" w:cstheme="minorBidi"/>
+        </w:rPr>
+        <w:t>SectionStack</w:t>
+      </w:r>
+      <w:r>
+        <w:rPr>
+          <w:rStyle w:val="HTMLCode"/>
+          <w:rFonts w:asciiTheme="minorBidi" w:hAnsiTheme="minorBidi" w:cstheme="minorBidi"/>
+        </w:rPr>
+        <w:t>.tsx</w:t>
+      </w:r>
+      <w:proofErr w:type="spellEnd"/>
+    </w:p>
+    <w:p>
+      <w:pPr>
+        <w:pStyle w:val="NormalWeb"/>
+        <w:numPr>
+          <w:ilvl w:val="1"/>
+          <w:numId w:val="1"/>
+        </w:numPr>
+        <w:rPr>
+          <w:rStyle w:val="HTMLCode"/>
+          <w:rFonts w:asciiTheme="minorBidi" w:hAnsiTheme="minorBidi" w:cstheme="minorBidi"/>
+        </w:rPr>
+      </w:pPr>
+      <w:proofErr w:type="spellStart"/>
+      <w:r>
+        <w:rPr>
+          <w:rStyle w:val="HTMLCode"/>
+          <w:rFonts w:asciiTheme="minorBidi" w:hAnsiTheme="minorBidi" w:cstheme="minorBidi"/>
+        </w:rPr>
+        <w:t>Testimonials</w:t>
+      </w:r>
+      <w:r>
+        <w:rPr>
+          <w:rStyle w:val="HTMLCode"/>
+          <w:rFonts w:asciiTheme="minorBidi" w:hAnsiTheme="minorBidi" w:cstheme="minorBidi"/>
+        </w:rPr>
+        <w:t>.tsx</w:t>
+      </w:r>
+      <w:proofErr w:type="spellEnd"/>
+    </w:p>
+    <w:p>
+      <w:pPr>
+        <w:pStyle w:val="NormalWeb"/>
+        <w:ind w:left="1440"/>
+        <w:rPr>
+          <w:rFonts w:asciiTheme="minorBidi" w:hAnsiTheme="minorBidi" w:cstheme="minorBidi"/>
+        </w:rPr>
+      </w:pPr>
+    </w:p>
+    <w:p>
+      <w:pPr>
+        <w:pStyle w:val="NormalWeb"/>
+        <w:numPr>
+          <w:ilvl w:val="0"/>
+          <w:numId w:val="1"/>
+        </w:numPr>
+        <w:rPr>
+          <w:rFonts w:asciiTheme="minorBidi" w:hAnsiTheme="minorBidi" w:cstheme="minorBidi"/>
+        </w:rPr>
+      </w:pPr>
+      <w:r>
+        <w:rPr>
+          <w:rStyle w:val="Strong"/>
+          <w:rFonts w:asciiTheme="minorBidi" w:hAnsiTheme="minorBidi" w:cstheme="minorBidi"/>
+        </w:rPr>
+        <w:t>lib/</w:t>
+      </w:r>
+    </w:p>
+    <w:p>
+      <w:pPr>
+        <w:pStyle w:val="NormalWeb"/>
+        <w:numPr>
+          <w:ilvl w:val="1"/>
+          <w:numId w:val="1"/>
+        </w:numPr>
+        <w:rPr>
+          <w:rFonts w:asciiTheme="minorBidi" w:hAnsiTheme="minorBidi" w:cstheme="minorBidi"/>
+        </w:rPr>
+      </w:pPr>
+      <w:proofErr w:type="spellStart"/>
+      <w:r>
+        <w:rPr>
+          <w:rStyle w:val="HTMLCode"/>
+          <w:rFonts w:asciiTheme="minorBidi" w:hAnsiTheme="minorBidi" w:cstheme="minorBidi"/>
+        </w:rPr>
+        <w:t>animations.ts</w:t>
+      </w:r>
+      <w:proofErr w:type="spellEnd"/>
+    </w:p>
+    <w:p>
+      <w:pPr>
+        <w:pStyle w:val="NormalWeb"/>
+        <w:numPr>
+          <w:ilvl w:val="0"/>
+          <w:numId w:val="1"/>
+        </w:numPr>
+        <w:rPr>
+          <w:rFonts w:asciiTheme="minorBidi" w:hAnsiTheme="minorBidi" w:cstheme="minorBidi"/>
+        </w:rPr>
+      </w:pPr>
+      <w:r>
+        <w:rPr>
+          <w:rStyle w:val="Strong"/>
+          <w:rFonts w:asciiTheme="minorBidi" w:hAnsiTheme="minorBidi" w:cstheme="minorBidi"/>
+        </w:rPr>
+        <w:lastRenderedPageBreak/>
+        <w:t>public/</w:t>
+      </w:r>
+    </w:p>
+    <w:p>
+      <w:pPr>
+        <w:pStyle w:val="NormalWeb"/>
+        <w:numPr>
+          <w:ilvl w:val="1"/>
+          <w:numId w:val="1"/>
+        </w:numPr>
+        <w:rPr>
+          <w:rFonts w:asciiTheme="minorBidi" w:hAnsiTheme="minorBidi" w:cstheme="minorBidi"/>
+        </w:rPr>
+      </w:pPr>
+      <w:r>
+        <w:rPr>
+          <w:rStyle w:val="HTMLCode"/>
+          <w:rFonts w:asciiTheme="minorBidi" w:hAnsiTheme="minorBidi" w:cstheme="minorBidi"/>
+        </w:rPr>
+        <w:t>logo.png</w:t>
+      </w:r>
+      <w:r>
+        <w:rPr>
+          <w:rFonts w:asciiTheme="minorBidi" w:hAnsiTheme="minorBidi" w:cstheme="minorBidi"/>
+        </w:rPr>
+        <w:t xml:space="preserve"> </w:t>
+      </w:r>
+      <w:r>
+        <w:rPr>
+          <w:rStyle w:val="Emphasis"/>
+          <w:rFonts w:asciiTheme="minorBidi" w:hAnsiTheme="minorBidi" w:cstheme="minorBidi"/>
+        </w:rPr>
+        <w:t>(site logo – optional)</w:t>
+      </w:r>
+    </w:p>
+    <w:p>
+      <w:pPr>
+        <w:pStyle w:val="NormalWeb"/>
+        <w:numPr>
+          <w:ilvl w:val="0"/>
+          <w:numId w:val="1"/>
+        </w:numPr>
+        <w:rPr>
+          <w:rFonts w:asciiTheme="minorBidi" w:hAnsiTheme="minorBidi" w:cstheme="minorBidi"/>
+        </w:rPr>
+      </w:pPr>
+      <w:proofErr w:type="spellStart"/>
+      <w:proofErr w:type="gramStart"/>
+      <w:r>
+        <w:rPr>
+          <w:rStyle w:val="HTMLCode"/>
+          <w:rFonts w:asciiTheme="minorBidi" w:hAnsiTheme="minorBidi" w:cstheme="minorBidi"/>
+        </w:rPr>
+        <w:t>package.json</w:t>
+      </w:r>
+      <w:proofErr w:type="spellEnd"/>
+      <w:proofErr w:type="gramEnd"/>
+    </w:p>
+    <w:p>
+      <w:pPr>
+        <w:pStyle w:val="NormalWeb"/>
+        <w:numPr>
+          <w:ilvl w:val="0"/>
+          <w:numId w:val="1"/>
+        </w:numPr>
+        <w:rPr>
+          <w:rFonts w:asciiTheme="minorBidi" w:hAnsiTheme="minorBidi" w:cstheme="minorBidi"/>
+        </w:rPr>
+      </w:pPr>
+      <w:r>
+        <w:rPr>
+          <w:rStyle w:val="HTMLCode"/>
+          <w:rFonts w:asciiTheme="minorBidi" w:hAnsiTheme="minorBidi" w:cstheme="minorBidi"/>
+        </w:rPr>
+        <w:t>tailwind.config.js</w:t>
+      </w:r>
+    </w:p>
+    <w:p>
+      <w:pPr>
+        <w:pStyle w:val="NormalWeb"/>
+        <w:numPr>
+          <w:ilvl w:val="0"/>
+          <w:numId w:val="1"/>
+        </w:numPr>
+        <w:rPr>
+          <w:rFonts w:asciiTheme="minorBidi" w:hAnsiTheme="minorBidi" w:cstheme="minorBidi"/>
+        </w:rPr>
+      </w:pPr>
+      <w:r>
+        <w:rPr>
+          <w:rStyle w:val="HTMLCode"/>
+          <w:rFonts w:asciiTheme="minorBidi" w:hAnsiTheme="minorBidi" w:cstheme="minorBidi"/>
+        </w:rPr>
+        <w:t>postcss.config.js</w:t>
+      </w:r>
+    </w:p>
+    <w:p>
+      <w:pPr>
+        <w:pStyle w:val="NormalWeb"/>
+        <w:numPr>
+          <w:ilvl w:val="0"/>
+          <w:numId w:val="1"/>
+        </w:numPr>
+        <w:rPr>
+          <w:rFonts w:asciiTheme="minorBidi" w:hAnsiTheme="minorBidi" w:cstheme="minorBidi"/>
+        </w:rPr>
+      </w:pPr>
+      <w:proofErr w:type="spellStart"/>
+      <w:proofErr w:type="gramStart"/>
+      <w:r>
+        <w:rPr>
+          <w:rStyle w:val="HTMLCode"/>
+          <w:rFonts w:asciiTheme="minorBidi" w:hAnsiTheme="minorBidi" w:cstheme="minorBidi"/>
+        </w:rPr>
+        <w:t>tsconfig.json</w:t>
+      </w:r>
+      <w:proofErr w:type="spellEnd"/>
+      <w:proofErr w:type="gramEnd"/>
+    </w:p>
+    <w:p>
+      <w:pPr>
+        <w:pStyle w:val="NormalWeb"/>
+        <w:numPr>
+          <w:ilvl w:val="0"/>
+          <w:numId w:val="1"/>
+        </w:numPr>
+        <w:rPr>
+          <w:rFonts w:asciiTheme="minorBidi" w:hAnsiTheme="minorBidi" w:cstheme="minorBidi"/>
+        </w:rPr>
+      </w:pPr>
+      <w:r>
+        <w:rPr>
+          <w:rStyle w:val="HTMLCode"/>
+          <w:rFonts w:asciiTheme="minorBidi" w:hAnsiTheme="minorBidi" w:cstheme="minorBidi"/>
+        </w:rPr>
+        <w:t>next.config.js</w:t>
+      </w:r>
+    </w:p>
+    <w:p/>
     <w:sectPr>
       <w:pgSz w:w="12240" w:h="15840"/>
       <w:pgMar w:top="1440" w:right="1440" w:bottom="1440" w:left="1440" w:header="720" w:footer="720" w:gutter="0"/>
@@ -384,8 +1230,138 @@
 </w:document>
 </file>
 
+<file path=word/numbering.xml><?xml version="1.0" encoding="utf-8"?>
+<w:numbering xmlns:wpc="http://schemas.microsoft.com/office/word/2010/wordprocessingCanvas" xmlns:cx="http://schemas.microsoft.com/office/drawing/2014/chartex" xmlns:cx1="http://schemas.microsoft.com/office/drawing/2015/9/8/chartex" xmlns:cx2="http://schemas.microsoft.com/office/drawing/2015/10/21/chartex" xmlns:cx3="http://schemas.microsoft.com/office/drawing/2016/5/9/chartex" xmlns:cx4="http://schemas.microsoft.com/office/drawing/2016/5/10/chartex" xmlns:cx5="http://schemas.microsoft.com/office/drawing/2016/5/11/chartex" xmlns:cx6="http://schemas.microsoft.com/office/drawing/2016/5/12/chartex" xmlns:cx7="http://schemas.microsoft.com/office/drawing/2016/5/13/chartex" xmlns:cx8="http://schemas.microsoft.com/office/drawing/2016/5/14/chartex" xmlns:mc="http://schemas.openxmlformats.org/markup-compatibility/2006" xmlns:aink="http://schemas.microsoft.com/office/drawing/2016/ink" xmlns:am3d="http://schemas.microsoft.com/office/drawing/2017/model3d" xmlns:o="urn:schemas-microsoft-com:office:office" xmlns:oel="http://schemas.microsoft.com/office/2019/extlst" xmlns:r="http://schemas.openxmlformats.org/officeDocument/2006/relationships" xmlns:m="http://schemas.openxmlformats.org/officeDocument/2006/math" xmlns:v="urn:schemas-microsoft-com:vml" xmlns:wp14="http://schemas.microsoft.com/office/word/2010/wordprocessingDrawing" xmlns:wp="http://schemas.openxmlformats.org/drawingml/2006/wordprocessingDrawing" xmlns:w10="urn:schemas-microsoft-com:office:word" xmlns:w="http://schemas.openxmlformats.org/wordprocessingml/2006/main" xmlns:w14="http://schemas.microsoft.com/office/word/2010/wordml" xmlns:w15="http://schemas.microsoft.com/office/word/2012/wordml" xmlns:w16cex="http://schemas.microsoft.com/office/word/2018/wordml/cex" xmlns:w16cid="http://schemas.microsoft.com/office/word/2016/wordml/cid" xmlns:w16="http://schemas.microsoft.com/office/word/2018/wordml" xmlns:w16du="http://schemas.microsoft.com/office/word/2023/wordml/word16du" xmlns:w16sdtdh="http://schemas.microsoft.com/office/word/2020/wordml/sdtdatahash" xmlns:w16sdtfl="http://schemas.microsoft.com/office/word/2024/wordml/sdtformatlock" xmlns:w16se="http://schemas.microsoft.com/office/word/2015/wordml/symex" xmlns:wpg="http://schemas.microsoft.com/office/word/2010/wordprocessingGroup" xmlns:wpi="http://schemas.microsoft.com/office/word/2010/wordprocessingInk" xmlns:wne="http://schemas.microsoft.com/office/word/2006/wordml" xmlns:wps="http://schemas.microsoft.com/office/word/2010/wordprocessingShape" mc:Ignorable="w14 w15 w16se w16cid w16 w16cex w16sdtdh w16sdtfl w16du wp14">
+  <w:abstractNum w:abstractNumId="0" w15:restartNumberingAfterBreak="0">
+    <w:nsid w:val="09B8766F"/>
+    <w:multiLevelType w:val="hybridMultilevel"/>
+    <w:tmpl w:val="0409000F"/>
+    <w:lvl w:ilvl="0" w:tplc="FFFFFFFF">
+      <w:start w:val="1"/>
+      <w:numFmt w:val="decimal"/>
+      <w:lvlText w:val="%1."/>
+      <w:lvlJc w:val="left"/>
+      <w:pPr>
+        <w:ind w:left="720" w:hanging="360"/>
+      </w:pPr>
+      <w:rPr>
+        <w:rFonts w:hint="default"/>
+        <w:sz w:val="20"/>
+      </w:rPr>
+    </w:lvl>
+    <w:lvl w:ilvl="1" w:tplc="FFFFFFFF">
+      <w:start w:val="1"/>
+      <w:numFmt w:val="lowerLetter"/>
+      <w:lvlText w:val="%2."/>
+      <w:lvlJc w:val="left"/>
+      <w:pPr>
+        <w:ind w:left="1440" w:hanging="360"/>
+      </w:pPr>
+      <w:rPr>
+        <w:rFonts w:hint="default"/>
+        <w:sz w:val="20"/>
+      </w:rPr>
+    </w:lvl>
+    <w:lvl w:ilvl="2" w:tplc="FFFFFFFF" w:tentative="1">
+      <w:start w:val="1"/>
+      <w:numFmt w:val="lowerRoman"/>
+      <w:lvlText w:val="%3."/>
+      <w:lvlJc w:val="right"/>
+      <w:pPr>
+        <w:ind w:left="2160" w:hanging="180"/>
+      </w:pPr>
+      <w:rPr>
+        <w:rFonts w:hint="default"/>
+        <w:sz w:val="20"/>
+      </w:rPr>
+    </w:lvl>
+    <w:lvl w:ilvl="3" w:tplc="FFFFFFFF" w:tentative="1">
+      <w:start w:val="1"/>
+      <w:numFmt w:val="decimal"/>
+      <w:lvlText w:val="%4."/>
+      <w:lvlJc w:val="left"/>
+      <w:pPr>
+        <w:ind w:left="2880" w:hanging="360"/>
+      </w:pPr>
+      <w:rPr>
+        <w:rFonts w:hint="default"/>
+        <w:sz w:val="20"/>
+      </w:rPr>
+    </w:lvl>
+    <w:lvl w:ilvl="4" w:tplc="FFFFFFFF" w:tentative="1">
+      <w:start w:val="1"/>
+      <w:numFmt w:val="lowerLetter"/>
+      <w:lvlText w:val="%5."/>
+      <w:lvlJc w:val="left"/>
+      <w:pPr>
+        <w:ind w:left="3600" w:hanging="360"/>
+      </w:pPr>
+      <w:rPr>
+        <w:rFonts w:hint="default"/>
+        <w:sz w:val="20"/>
+      </w:rPr>
+    </w:lvl>
+    <w:lvl w:ilvl="5" w:tplc="FFFFFFFF" w:tentative="1">
+      <w:start w:val="1"/>
+      <w:numFmt w:val="lowerRoman"/>
+      <w:lvlText w:val="%6."/>
+      <w:lvlJc w:val="right"/>
+      <w:pPr>
+        <w:ind w:left="4320" w:hanging="180"/>
+      </w:pPr>
+      <w:rPr>
+        <w:rFonts w:hint="default"/>
+        <w:sz w:val="20"/>
+      </w:rPr>
+    </w:lvl>
+    <w:lvl w:ilvl="6" w:tplc="FFFFFFFF" w:tentative="1">
+      <w:start w:val="1"/>
+      <w:numFmt w:val="decimal"/>
+      <w:lvlText w:val="%7."/>
+      <w:lvlJc w:val="left"/>
+      <w:pPr>
+        <w:ind w:left="5040" w:hanging="360"/>
+      </w:pPr>
+      <w:rPr>
+        <w:rFonts w:hint="default"/>
+        <w:sz w:val="20"/>
+      </w:rPr>
+    </w:lvl>
+    <w:lvl w:ilvl="7" w:tplc="FFFFFFFF" w:tentative="1">
+      <w:start w:val="1"/>
+      <w:numFmt w:val="lowerLetter"/>
+      <w:lvlText w:val="%8."/>
+      <w:lvlJc w:val="left"/>
+      <w:pPr>
+        <w:ind w:left="5760" w:hanging="360"/>
+      </w:pPr>
+      <w:rPr>
+        <w:rFonts w:hint="default"/>
+        <w:sz w:val="20"/>
+      </w:rPr>
+    </w:lvl>
+    <w:lvl w:ilvl="8" w:tplc="FFFFFFFF" w:tentative="1">
+      <w:start w:val="1"/>
+      <w:numFmt w:val="lowerRoman"/>
+      <w:lvlText w:val="%9."/>
+      <w:lvlJc w:val="right"/>
+      <w:pPr>
+        <w:ind w:left="6480" w:hanging="180"/>
+      </w:pPr>
+      <w:rPr>
+        <w:rFonts w:hint="default"/>
+        <w:sz w:val="20"/>
+      </w:rPr>
+    </w:lvl>
+  </w:abstractNum>
+  <w:num w:numId="1" w16cid:durableId="64841154">
+    <w:abstractNumId w:val="0"/>
+  </w:num>
+</w:numbering>
+</file>
+
 <file path=word/styles.xml><?xml version="1.0" encoding="utf-8"?>
-<w:styles xmlns:mc="http://schemas.openxmlformats.org/markup-compatibility/2006" xmlns:r="http://schemas.openxmlformats.org/officeDocument/2006/relationships" xmlns:w="http://schemas.openxmlformats.org/wordprocessingml/2006/main" xmlns:w14="http://schemas.microsoft.com/office/word/2010/wordml" xmlns:w15="http://schemas.microsoft.com/office/word/2012/wordml" xmlns:w16cex="http://schemas.microsoft.com/office/word/2018/wordml/cex" xmlns:w16cid="http://schemas.microsoft.com/office/word/2016/wordml/cid" xmlns:w16="http://schemas.microsoft.com/office/word/2018/wordml" xmlns:w16sdtdh="http://schemas.microsoft.com/office/word/2020/wordml/sdtdatahash" xmlns:w16se="http://schemas.microsoft.com/office/word/2015/wordml/symex" mc:Ignorable="w14 w15 w16se w16cid w16 w16cex w16sdtdh">
+<w:styles xmlns:mc="http://schemas.openxmlformats.org/markup-compatibility/2006" xmlns:r="http://schemas.openxmlformats.org/officeDocument/2006/relationships" xmlns:w="http://schemas.openxmlformats.org/wordprocessingml/2006/main" xmlns:w14="http://schemas.microsoft.com/office/word/2010/wordml" xmlns:w15="http://schemas.microsoft.com/office/word/2012/wordml" xmlns:w16cex="http://schemas.microsoft.com/office/word/2018/wordml/cex" xmlns:w16cid="http://schemas.microsoft.com/office/word/2016/wordml/cid" xmlns:w16="http://schemas.microsoft.com/office/word/2018/wordml" xmlns:w16du="http://schemas.microsoft.com/office/word/2023/wordml/word16du" xmlns:w16sdtdh="http://schemas.microsoft.com/office/word/2020/wordml/sdtdatahash" xmlns:w16sdtfl="http://schemas.microsoft.com/office/word/2024/wordml/sdtformatlock" xmlns:w16se="http://schemas.microsoft.com/office/word/2015/wordml/symex" mc:Ignorable="w14 w15 w16se w16cid w16 w16cex w16sdtdh w16sdtfl w16du">
   <w:docDefaults>
     <w:rPrDefault>
       <w:rPr>
@@ -815,6 +1791,59 @@
     <w:semiHidden/>
     <w:unhideWhenUsed/>
   </w:style>
+  <w:style w:type="paragraph" w:styleId="NormalWeb">
+    <w:name w:val="Normal (Web)"/>
+    <w:basedOn w:val="Normal"/>
+    <w:uiPriority w:val="99"/>
+    <w:semiHidden/>
+    <w:unhideWhenUsed/>
+    <w:rsid w:val="00D30308"/>
+    <w:pPr>
+      <w:spacing w:before="100" w:beforeAutospacing="1" w:after="100" w:afterAutospacing="1"/>
+      <w:jc w:val="left"/>
+    </w:pPr>
+    <w:rPr>
+      <w:rFonts w:ascii="Times New Roman" w:eastAsia="Times New Roman" w:hAnsi="Times New Roman" w:cs="Times New Roman"/>
+      <w:color w:val="auto"/>
+      <w:sz w:val="24"/>
+      <w:szCs w:val="24"/>
+    </w:rPr>
+  </w:style>
+  <w:style w:type="character" w:styleId="Strong">
+    <w:name w:val="Strong"/>
+    <w:basedOn w:val="DefaultParagraphFont"/>
+    <w:uiPriority w:val="22"/>
+    <w:qFormat/>
+    <w:rsid w:val="00D30308"/>
+    <w:rPr>
+      <w:b/>
+      <w:bCs/>
+    </w:rPr>
+  </w:style>
+  <w:style w:type="character" w:styleId="HTMLCode">
+    <w:name w:val="HTML Code"/>
+    <w:basedOn w:val="DefaultParagraphFont"/>
+    <w:uiPriority w:val="99"/>
+    <w:semiHidden/>
+    <w:unhideWhenUsed/>
+    <w:rsid w:val="00D30308"/>
+    <w:rPr>
+      <w:rFonts w:ascii="Courier New" w:eastAsia="Times New Roman" w:hAnsi="Courier New" w:cs="Courier New"/>
+      <w:sz w:val="20"/>
+      <w:szCs w:val="20"/>
+    </w:rPr>
+  </w:style>
+  <w:style w:type="character" w:styleId="Emphasis">
+    <w:name w:val="Emphasis"/>
+    <w:basedOn w:val="DefaultParagraphFont"/>
+    <w:uiPriority w:val="20"/>
+    <w:qFormat/>
+    <w:rsid w:val="00D30308"/>
+    <w:rPr>
+      <w:i/>
+      <w:iCs/>
+    </w:rPr>
+  </w:style>
 </w:styles>
 </file>
 

</xml_diff>